<commit_message>
update course manual and project
</commit_message>
<xml_diff>
--- a/materials/template_assignment1.docx
+++ b/materials/template_assignment1.docx
@@ -1,6 +1,6 @@
 
 <file path=word/document.xml><?xml version="1.0" encoding="utf-8"?>
-<w:document xmlns:wpc="http://schemas.microsoft.com/office/word/2010/wordprocessingCanvas" xmlns:cx="http://schemas.microsoft.com/office/drawing/2014/chartex" xmlns:cx1="http://schemas.microsoft.com/office/drawing/2015/9/8/chartex" xmlns:cx2="http://schemas.microsoft.com/office/drawing/2015/10/21/chartex" xmlns:cx3="http://schemas.microsoft.com/office/drawing/2016/5/9/chartex" xmlns:cx4="http://schemas.microsoft.com/office/drawing/2016/5/10/chartex" xmlns:cx5="http://schemas.microsoft.com/office/drawing/2016/5/11/chartex" xmlns:cx6="http://schemas.microsoft.com/office/drawing/2016/5/12/chartex" xmlns:cx7="http://schemas.microsoft.com/office/drawing/2016/5/13/chartex" xmlns:cx8="http://schemas.microsoft.com/office/drawing/2016/5/14/chartex" xmlns:mc="http://schemas.openxmlformats.org/markup-compatibility/2006" xmlns:aink="http://schemas.microsoft.com/office/drawing/2016/ink" xmlns:am3d="http://schemas.microsoft.com/office/drawing/2017/model3d" xmlns:o="urn:schemas-microsoft-com:office:office" xmlns:oel="http://schemas.microsoft.com/office/2019/extlst" xmlns:r="http://schemas.openxmlformats.org/officeDocument/2006/relationships" xmlns:m="http://schemas.openxmlformats.org/officeDocument/2006/math" xmlns:v="urn:schemas-microsoft-com:vml" xmlns:wp14="http://schemas.microsoft.com/office/word/2010/wordprocessingDrawing" xmlns:wp="http://schemas.openxmlformats.org/drawingml/2006/wordprocessingDrawing" xmlns:w10="urn:schemas-microsoft-com:office:word" xmlns:w="http://schemas.openxmlformats.org/wordprocessingml/2006/main" xmlns:w14="http://schemas.microsoft.com/office/word/2010/wordml" xmlns:w15="http://schemas.microsoft.com/office/word/2012/wordml" xmlns:w16cex="http://schemas.microsoft.com/office/word/2018/wordml/cex" xmlns:w16cid="http://schemas.microsoft.com/office/word/2016/wordml/cid" xmlns:w16="http://schemas.microsoft.com/office/word/2018/wordml" xmlns:w16du="http://schemas.microsoft.com/office/word/2023/wordml/word16du" xmlns:w16sdtdh="http://schemas.microsoft.com/office/word/2020/wordml/sdtdatahash" xmlns:w16sdtfl="http://schemas.microsoft.com/office/word/2024/wordml/sdtformatlock" xmlns:w16se="http://schemas.microsoft.com/office/word/2015/wordml/symex" xmlns:wpg="http://schemas.microsoft.com/office/word/2010/wordprocessingGroup" xmlns:wpi="http://schemas.microsoft.com/office/word/2010/wordprocessingInk" xmlns:wne="http://schemas.microsoft.com/office/word/2006/wordml" xmlns:wps="http://schemas.microsoft.com/office/word/2010/wordprocessingShape" mc:Ignorable="w14 w15 w16se w16cid w16 w16cex w16sdtdh w16sdtfl w16du wp14">
+<w:document xmlns:wpc="http://schemas.microsoft.com/office/word/2010/wordprocessingCanvas" xmlns:cx="http://schemas.microsoft.com/office/drawing/2014/chartex" xmlns:cx1="http://schemas.microsoft.com/office/drawing/2015/9/8/chartex" xmlns:cx2="http://schemas.microsoft.com/office/drawing/2015/10/21/chartex" xmlns:cx3="http://schemas.microsoft.com/office/drawing/2016/5/9/chartex" xmlns:cx4="http://schemas.microsoft.com/office/drawing/2016/5/10/chartex" xmlns:cx5="http://schemas.microsoft.com/office/drawing/2016/5/11/chartex" xmlns:cx6="http://schemas.microsoft.com/office/drawing/2016/5/12/chartex" xmlns:cx7="http://schemas.microsoft.com/office/drawing/2016/5/13/chartex" xmlns:cx8="http://schemas.microsoft.com/office/drawing/2016/5/14/chartex" xmlns:mc="http://schemas.openxmlformats.org/markup-compatibility/2006" xmlns:m="http://schemas.openxmlformats.org/officeDocument/2006/math" xmlns:aink="http://schemas.microsoft.com/office/drawing/2016/ink" xmlns:am3d="http://schemas.microsoft.com/office/drawing/2017/model3d" xmlns:oel="http://schemas.microsoft.com/office/2019/extlst" xmlns:r="http://schemas.openxmlformats.org/officeDocument/2006/relationships" xmlns:wp14="http://schemas.microsoft.com/office/word/2010/wordprocessingDrawing" xmlns:wp="http://schemas.openxmlformats.org/drawingml/2006/wordprocessingDrawing" xmlns:wpg="http://schemas.microsoft.com/office/word/2010/wordprocessingGroup" xmlns:wpi="http://schemas.microsoft.com/office/word/2010/wordprocessingInk" xmlns:wps="http://schemas.microsoft.com/office/word/2010/wordprocessingShape" xmlns:o="urn:schemas-microsoft-com:office:office" xmlns:v="urn:schemas-microsoft-com:vml" xmlns:w10="urn:schemas-microsoft-com:office:word" xmlns:w="http://schemas.openxmlformats.org/wordprocessingml/2006/main" xmlns:w14="http://schemas.microsoft.com/office/word/2010/wordml" xmlns:w15="http://schemas.microsoft.com/office/word/2012/wordml" xmlns:w16cex="http://schemas.microsoft.com/office/word/2018/wordml/cex" xmlns:w16cid="http://schemas.microsoft.com/office/word/2016/wordml/cid" xmlns:w16="http://schemas.microsoft.com/office/word/2018/wordml" xmlns:w16sdtdh="http://schemas.microsoft.com/office/word/2020/wordml/sdtdatahash" xmlns:w16sdtfl="http://schemas.microsoft.com/office/word/2024/wordml/sdtformatlock" xmlns:w16se="http://schemas.microsoft.com/office/word/2015/wordml/symex" xmlns:w16du="http://schemas.microsoft.com/office/word/2023/wordml/word16du" xmlns:wne="http://schemas.microsoft.com/office/word/2006/wordml" mc:Ignorable="w14 w15 w16se w16cid w16 w16cex w16sdtdh w16sdtfl w16du wp14">
   <w:body>
     <w:p>
       <w:pPr>
@@ -272,19 +272,8 @@
           <w:sz w:val="26"/>
           <w:szCs w:val="26"/>
         </w:rPr>
-        <w:t xml:space="preserve">3. Data </w:t>
-      </w:r>
-      <w:proofErr w:type="spellStart"/>
-      <w:r>
-        <w:rPr>
-          <w:rFonts w:asciiTheme="majorHAnsi" w:eastAsiaTheme="majorEastAsia" w:hAnsiTheme="majorHAnsi" w:cstheme="majorBidi"/>
-          <w:color w:val="365F91" w:themeColor="accent1" w:themeShade="BF"/>
-          <w:sz w:val="26"/>
-          <w:szCs w:val="26"/>
-        </w:rPr>
-        <w:t>Description</w:t>
-      </w:r>
-      <w:proofErr w:type="spellEnd"/>
+        <w:t>3. Data Description</w:t>
+      </w:r>
     </w:p>
     <w:p>
       <w:pPr>
@@ -480,6 +469,17 @@
         <w:jc w:val="both"/>
         <w:rPr>
           <w:rFonts w:asciiTheme="majorHAnsi" w:eastAsiaTheme="majorEastAsia" w:hAnsiTheme="majorHAnsi" w:cstheme="majorBidi"/>
+          <w:color w:val="365F91" w:themeColor="accent1" w:themeShade="BF"/>
+          <w:sz w:val="26"/>
+          <w:szCs w:val="26"/>
+        </w:rPr>
+      </w:pPr>
+    </w:p>
+    <w:p>
+      <w:pPr>
+        <w:jc w:val="both"/>
+        <w:rPr>
+          <w:rFonts w:asciiTheme="majorHAnsi" w:eastAsiaTheme="majorEastAsia" w:hAnsiTheme="majorHAnsi" w:cstheme="majorBidi"/>
           <w:color w:val="000000" w:themeColor="text1"/>
           <w:sz w:val="26"/>
           <w:szCs w:val="26"/>
@@ -521,34 +521,140 @@
       <w:pPr>
         <w:jc w:val="both"/>
         <w:rPr>
-          <w:rFonts w:cstheme="minorHAnsi"/>
-          <w:b/>
-          <w:sz w:val="24"/>
-          <w:lang w:val="en-US"/>
-        </w:rPr>
-      </w:pPr>
+          <w:rFonts w:asciiTheme="majorHAnsi" w:eastAsiaTheme="majorEastAsia" w:hAnsiTheme="majorHAnsi" w:cstheme="majorBidi"/>
+          <w:color w:val="000000" w:themeColor="text1"/>
+          <w:sz w:val="26"/>
+          <w:szCs w:val="26"/>
+        </w:rPr>
+      </w:pPr>
+      <w:proofErr w:type="spellStart"/>
+      <w:r>
+        <w:rPr>
+          <w:rFonts w:asciiTheme="majorHAnsi" w:eastAsiaTheme="majorEastAsia" w:hAnsiTheme="majorHAnsi" w:cstheme="majorBidi"/>
+          <w:color w:val="000000" w:themeColor="text1"/>
+          <w:sz w:val="26"/>
+          <w:szCs w:val="26"/>
+        </w:rPr>
+        <w:t>Reflection</w:t>
+      </w:r>
+      <w:proofErr w:type="spellEnd"/>
+      <w:r>
+        <w:rPr>
+          <w:rFonts w:asciiTheme="majorHAnsi" w:eastAsiaTheme="majorEastAsia" w:hAnsiTheme="majorHAnsi" w:cstheme="majorBidi"/>
+          <w:color w:val="000000" w:themeColor="text1"/>
+          <w:sz w:val="26"/>
+          <w:szCs w:val="26"/>
+        </w:rPr>
+        <w:t xml:space="preserve"> on </w:t>
+      </w:r>
+      <w:proofErr w:type="spellStart"/>
+      <w:r>
+        <w:rPr>
+          <w:rFonts w:asciiTheme="majorHAnsi" w:eastAsiaTheme="majorEastAsia" w:hAnsiTheme="majorHAnsi" w:cstheme="majorBidi"/>
+          <w:color w:val="000000" w:themeColor="text1"/>
+          <w:sz w:val="26"/>
+          <w:szCs w:val="26"/>
+        </w:rPr>
+        <w:t>the</w:t>
+      </w:r>
+      <w:proofErr w:type="spellEnd"/>
+      <w:r>
+        <w:rPr>
+          <w:rFonts w:asciiTheme="majorHAnsi" w:eastAsiaTheme="majorEastAsia" w:hAnsiTheme="majorHAnsi" w:cstheme="majorBidi"/>
+          <w:color w:val="000000" w:themeColor="text1"/>
+          <w:sz w:val="26"/>
+          <w:szCs w:val="26"/>
+        </w:rPr>
+        <w:t xml:space="preserve"> </w:t>
+      </w:r>
+      <w:proofErr w:type="spellStart"/>
+      <w:r>
+        <w:rPr>
+          <w:rFonts w:asciiTheme="majorHAnsi" w:eastAsiaTheme="majorEastAsia" w:hAnsiTheme="majorHAnsi" w:cstheme="majorBidi"/>
+          <w:color w:val="000000" w:themeColor="text1"/>
+          <w:sz w:val="26"/>
+          <w:szCs w:val="26"/>
+        </w:rPr>
+        <w:t>use</w:t>
+      </w:r>
+      <w:proofErr w:type="spellEnd"/>
+      <w:r>
+        <w:rPr>
+          <w:rFonts w:asciiTheme="majorHAnsi" w:eastAsiaTheme="majorEastAsia" w:hAnsiTheme="majorHAnsi" w:cstheme="majorBidi"/>
+          <w:color w:val="000000" w:themeColor="text1"/>
+          <w:sz w:val="26"/>
+          <w:szCs w:val="26"/>
+        </w:rPr>
+        <w:t xml:space="preserve"> of </w:t>
+      </w:r>
+      <w:proofErr w:type="spellStart"/>
+      <w:r>
+        <w:rPr>
+          <w:rFonts w:asciiTheme="majorHAnsi" w:eastAsiaTheme="majorEastAsia" w:hAnsiTheme="majorHAnsi" w:cstheme="majorBidi"/>
+          <w:color w:val="000000" w:themeColor="text1"/>
+          <w:sz w:val="26"/>
+          <w:szCs w:val="26"/>
+        </w:rPr>
+        <w:t>generative</w:t>
+      </w:r>
+      <w:proofErr w:type="spellEnd"/>
+      <w:r>
+        <w:rPr>
+          <w:rFonts w:asciiTheme="majorHAnsi" w:eastAsiaTheme="majorEastAsia" w:hAnsiTheme="majorHAnsi" w:cstheme="majorBidi"/>
+          <w:color w:val="000000" w:themeColor="text1"/>
+          <w:sz w:val="26"/>
+          <w:szCs w:val="26"/>
+        </w:rPr>
+        <w:t xml:space="preserve"> AI</w:t>
+      </w:r>
     </w:p>
     <w:p>
       <w:pPr>
+        <w:numPr>
+          <w:ilvl w:val="0"/>
+          <w:numId w:val="6"/>
+        </w:numPr>
         <w:jc w:val="both"/>
         <w:rPr>
           <w:rFonts w:cstheme="minorHAnsi"/>
-          <w:b/>
-          <w:sz w:val="24"/>
           <w:lang w:val="en-US"/>
         </w:rPr>
       </w:pPr>
-    </w:p>
-    <w:p>
-      <w:pPr>
-        <w:jc w:val="both"/>
+      <w:r>
         <w:rPr>
           <w:rFonts w:cstheme="minorHAnsi"/>
-          <w:b/>
-          <w:sz w:val="24"/>
           <w:lang w:val="en-US"/>
         </w:rPr>
-      </w:pPr>
+        <w:t>This section is required, but it is not graded or otherwise taken into consideration and does not count towards the 1,000-word limit. Include links to the conversation or conversations</w:t>
+      </w:r>
+      <w:r>
+        <w:rPr>
+          <w:rFonts w:cstheme="minorHAnsi"/>
+          <w:lang w:val="en-US"/>
+        </w:rPr>
+        <w:t xml:space="preserve"> with GenAI</w:t>
+      </w:r>
+      <w:r>
+        <w:rPr>
+          <w:rFonts w:cstheme="minorHAnsi"/>
+          <w:lang w:val="en-US"/>
+        </w:rPr>
+        <w:t xml:space="preserve">. </w:t>
+      </w:r>
+      <w:r>
+        <w:rPr>
+          <w:rFonts w:cstheme="minorHAnsi"/>
+          <w:lang w:val="en-US"/>
+        </w:rPr>
+        <w:t>Briefly i</w:t>
+      </w:r>
+      <w:r>
+        <w:rPr>
+          <w:rFonts w:cstheme="minorHAnsi"/>
+          <w:lang w:val="en-US"/>
+        </w:rPr>
+        <w:t>dentify where using GenAI resulted in cognitive offloading and where GenAI supported learning.</w:t>
+      </w:r>
     </w:p>
     <w:p>
       <w:pPr>
@@ -926,7 +1032,7 @@
                 <w:sz w:val="16"/>
                 <w:lang w:val="en-US"/>
               </w:rPr>
-              <w:t>Preparation of the feedback meeting &amp; amount of work done, based on the update presentation and general impression of the meeting.</w:t>
+              <w:t>Four feedback sessions (weeks 3, 4, 6 and 7), 20 points each; attendance and active participation at all four are mandatory. One process grade is used for both assignments. Assignment 1 group result first; both final grades after week 7.</w:t>
             </w:r>
           </w:p>
         </w:tc>
@@ -958,37 +1064,7 @@
                 <w:sz w:val="16"/>
                 <w:lang w:val="en-US"/>
               </w:rPr>
-              <w:t>The amount of work done was less than would have been expected on the basis of the amount of ECTS.</w:t>
-            </w:r>
-          </w:p>
-          <w:p>
-            <w:pPr>
-              <w:spacing w:after="0" w:line="240" w:lineRule="auto"/>
-              <w:rPr>
-                <w:rFonts w:eastAsia="Calibri"/>
-                <w:color w:val="C45911"/>
-                <w:sz w:val="16"/>
-                <w:lang w:val="en-US"/>
-              </w:rPr>
-            </w:pPr>
-          </w:p>
-          <w:p>
-            <w:pPr>
-              <w:spacing w:after="0" w:line="240" w:lineRule="auto"/>
-              <w:rPr>
-                <w:color w:val="C45911"/>
-                <w:sz w:val="16"/>
-                <w:lang w:val="en-US"/>
-              </w:rPr>
-            </w:pPr>
-            <w:r>
-              <w:rPr>
-                <w:rFonts w:eastAsia="Calibri"/>
-                <w:color w:val="C45911"/>
-                <w:sz w:val="16"/>
-                <w:lang w:val="en-US"/>
-              </w:rPr>
-              <w:t>The update slides are messy and do not show who worked on what. The slides do not show any of the considerations made.</w:t>
+              <w:t>0 points for a session if the student is absent, does not participate or participates very little. There are no intermediate session scores.</w:t>
             </w:r>
           </w:p>
         </w:tc>
@@ -1019,35 +1095,7 @@
                 <w:sz w:val="16"/>
                 <w:lang w:val="en-US"/>
               </w:rPr>
-              <w:t>The amount of work done was what would have been expected on the basis of the amount of ECTS.</w:t>
-            </w:r>
-            <w:r>
-              <w:rPr>
-                <w:rFonts w:eastAsia="Calibri"/>
-                <w:color w:val="BF8F00"/>
-                <w:sz w:val="16"/>
-                <w:lang w:val="en-US"/>
-              </w:rPr>
-              <w:br/>
-            </w:r>
-            <w:r>
-              <w:rPr>
-                <w:rFonts w:eastAsia="Calibri"/>
-                <w:color w:val="BF8F00"/>
-                <w:sz w:val="16"/>
-                <w:lang w:val="en-US"/>
-              </w:rPr>
-              <w:br/>
-              <w:t xml:space="preserve">The update slides are clear and convey who worked on what parts of the assignment. </w:t>
-            </w:r>
-            <w:r>
-              <w:rPr>
-                <w:rFonts w:eastAsia="Calibri"/>
-                <w:color w:val="BF8F00"/>
-                <w:sz w:val="16"/>
-                <w:lang w:val="en-US"/>
-              </w:rPr>
-              <w:t>Some of the considerations made in the assignment are presented.</w:t>
+              <w:t>20 points for each session attended with participation at the expected level.</w:t>
             </w:r>
           </w:p>
         </w:tc>
@@ -1078,74 +1126,7 @@
                 <w:sz w:val="16"/>
                 <w:lang w:val="en-US"/>
               </w:rPr>
-              <w:t>The amount of work done was more than would have been expected on the basis of the amount of ECTS.</w:t>
-            </w:r>
-            <w:r>
-              <w:rPr>
-                <w:rFonts w:eastAsia="Calibri"/>
-                <w:color w:val="538135"/>
-                <w:sz w:val="16"/>
-                <w:lang w:val="en-US"/>
-              </w:rPr>
-              <w:br/>
-            </w:r>
-            <w:r>
-              <w:rPr>
-                <w:rFonts w:eastAsia="Calibri"/>
-                <w:color w:val="538135"/>
-                <w:sz w:val="16"/>
-                <w:lang w:val="en-US"/>
-              </w:rPr>
-              <w:br/>
-              <w:t xml:space="preserve">The updates </w:t>
-            </w:r>
-            <w:proofErr w:type="gramStart"/>
-            <w:r>
-              <w:rPr>
-                <w:rFonts w:eastAsia="Calibri"/>
-                <w:color w:val="538135"/>
-                <w:sz w:val="16"/>
-                <w:lang w:val="en-US"/>
-              </w:rPr>
-              <w:t>slides</w:t>
-            </w:r>
-            <w:proofErr w:type="gramEnd"/>
-            <w:r>
-              <w:rPr>
-                <w:rFonts w:eastAsia="Calibri"/>
-                <w:color w:val="538135"/>
-                <w:sz w:val="16"/>
-                <w:lang w:val="en-US"/>
-              </w:rPr>
-              <w:t xml:space="preserve"> cover all topics that should be present in the assignment so far. It becomes clear who worked on what parts of the assignment. For all parts of the assignment considerations are given</w:t>
-            </w:r>
-            <w:r>
-              <w:rPr>
-                <w:rFonts w:eastAsia="Calibri"/>
-                <w:color w:val="538135"/>
-                <w:sz w:val="16"/>
-                <w:lang w:val="en-US"/>
-              </w:rPr>
-              <w:t>.</w:t>
-            </w:r>
-            <w:r>
-              <w:rPr>
-                <w:rFonts w:eastAsia="Calibri"/>
-                <w:color w:val="538135"/>
-                <w:sz w:val="16"/>
-                <w:lang w:val="en-US"/>
-              </w:rPr>
-              <w:br/>
-            </w:r>
-            <w:r>
-              <w:rPr>
-                <w:rFonts w:eastAsia="Calibri"/>
-                <w:color w:val="538135"/>
-                <w:sz w:val="16"/>
-                <w:lang w:val="en-US"/>
-              </w:rPr>
-              <w:br/>
-              <w:t xml:space="preserve">The student prepared points to discuss in the meeting. </w:t>
+              <w:t>Four sessions = 80 points. The points are divided by 10, so 80 points = an individual process grade of 8.0.</w:t>
             </w:r>
           </w:p>
         </w:tc>
@@ -1176,7 +1157,7 @@
                 <w:sz w:val="16"/>
                 <w:lang w:val="en-US"/>
               </w:rPr>
-              <w:t>0.2</w:t>
+              <w:t>0.24</w:t>
             </w:r>
           </w:p>
         </w:tc>
@@ -1232,7 +1213,7 @@
                 <w:sz w:val="16"/>
                 <w:lang w:val="en-US"/>
               </w:rPr>
-              <w:t>Active participation in the feedback moments</w:t>
+              <w:t>Consistently doing more than expected (20 extra points)</w:t>
             </w:r>
           </w:p>
         </w:tc>
@@ -1262,7 +1243,7 @@
                 <w:sz w:val="16"/>
                 <w:lang w:val="en-US"/>
               </w:rPr>
-              <w:t>The student did not participate in the feedback moments.</w:t>
+              <w:t>No extra points.</w:t>
             </w:r>
           </w:p>
         </w:tc>
@@ -1292,7 +1273,7 @@
                 <w:sz w:val="16"/>
                 <w:lang w:val="en-US"/>
               </w:rPr>
-              <w:t>The student participated actively.</w:t>
+              <w:t>No extra points. Participation meets expectations.</w:t>
             </w:r>
           </w:p>
         </w:tc>
@@ -1323,55 +1304,7 @@
                 <w:sz w:val="16"/>
                 <w:lang w:val="en-US"/>
               </w:rPr>
-              <w:t>The student participated actively</w:t>
-            </w:r>
-            <w:r>
-              <w:rPr>
-                <w:rFonts w:eastAsia="Calibri"/>
-                <w:color w:val="538135"/>
-                <w:sz w:val="16"/>
-                <w:lang w:val="en-US"/>
-              </w:rPr>
-              <w:t xml:space="preserve"> and showed </w:t>
-            </w:r>
-            <w:r>
-              <w:rPr>
-                <w:rFonts w:eastAsia="Calibri"/>
-                <w:color w:val="538135"/>
-                <w:sz w:val="16"/>
-                <w:lang w:val="en-US"/>
-              </w:rPr>
-              <w:t>a deep understanding of the project.</w:t>
-            </w:r>
-          </w:p>
-          <w:p>
-            <w:pPr>
-              <w:spacing w:after="0" w:line="240" w:lineRule="auto"/>
-              <w:rPr>
-                <w:rFonts w:eastAsia="Calibri"/>
-                <w:color w:val="538135"/>
-                <w:sz w:val="16"/>
-                <w:lang w:val="en-US"/>
-              </w:rPr>
-            </w:pPr>
-          </w:p>
-          <w:p>
-            <w:pPr>
-              <w:spacing w:after="0" w:line="240" w:lineRule="auto"/>
-              <w:rPr>
-                <w:color w:val="538135"/>
-                <w:sz w:val="16"/>
-                <w:lang w:val="en-US"/>
-              </w:rPr>
-            </w:pPr>
-            <w:r>
-              <w:rPr>
-                <w:rFonts w:eastAsia="Calibri"/>
-                <w:color w:val="538135"/>
-                <w:sz w:val="16"/>
-                <w:lang w:val="en-US"/>
-              </w:rPr>
-              <w:t>The student is proactive in bringing up the points and questions that they want to discuss.</w:t>
+              <w:t>20 extra points (all or nothing) for consistently exceeding expectations. Evidence: answers to practical instructors and progress-slide task/contributor records. Despite one zero, may be awarded if the overall contribution remains consistently exceptional. 100 points = 10.0. Report disagreements when they arise, no later than the next feedback session and before submission.</w:t>
             </w:r>
           </w:p>
         </w:tc>
@@ -1402,7 +1335,7 @@
                 <w:sz w:val="16"/>
                 <w:lang w:val="en-US"/>
               </w:rPr>
-              <w:t>0.1</w:t>
+              <w:t>0.06</w:t>
             </w:r>
           </w:p>
         </w:tc>
@@ -2093,27 +2026,7 @@
                 <w:sz w:val="16"/>
                 <w:lang w:val="en-US"/>
               </w:rPr>
-              <w:t xml:space="preserve">Report is poorly </w:t>
-            </w:r>
-            <w:proofErr w:type="gramStart"/>
-            <w:r>
-              <w:rPr>
-                <w:rFonts w:eastAsia="Calibri"/>
-                <w:color w:val="C45911"/>
-                <w:sz w:val="16"/>
-                <w:lang w:val="en-US"/>
-              </w:rPr>
-              <w:t>organized,</w:t>
-            </w:r>
-            <w:proofErr w:type="gramEnd"/>
-            <w:r>
-              <w:rPr>
-                <w:rFonts w:eastAsia="Calibri"/>
-                <w:color w:val="C45911"/>
-                <w:sz w:val="16"/>
-                <w:lang w:val="en-US"/>
-              </w:rPr>
-              <w:t xml:space="preserve"> few references are present.</w:t>
+              <w:t>Report is poorly organized, few references are present.</w:t>
             </w:r>
           </w:p>
         </w:tc>
@@ -2395,7 +2308,7 @@
 </file>
 
 <file path=word/numbering.xml><?xml version="1.0" encoding="utf-8"?>
-<w:numbering xmlns:wpc="http://schemas.microsoft.com/office/word/2010/wordprocessingCanvas" xmlns:cx="http://schemas.microsoft.com/office/drawing/2014/chartex" xmlns:cx1="http://schemas.microsoft.com/office/drawing/2015/9/8/chartex" xmlns:cx2="http://schemas.microsoft.com/office/drawing/2015/10/21/chartex" xmlns:cx3="http://schemas.microsoft.com/office/drawing/2016/5/9/chartex" xmlns:cx4="http://schemas.microsoft.com/office/drawing/2016/5/10/chartex" xmlns:cx5="http://schemas.microsoft.com/office/drawing/2016/5/11/chartex" xmlns:cx6="http://schemas.microsoft.com/office/drawing/2016/5/12/chartex" xmlns:cx7="http://schemas.microsoft.com/office/drawing/2016/5/13/chartex" xmlns:cx8="http://schemas.microsoft.com/office/drawing/2016/5/14/chartex" xmlns:mc="http://schemas.openxmlformats.org/markup-compatibility/2006" xmlns:aink="http://schemas.microsoft.com/office/drawing/2016/ink" xmlns:am3d="http://schemas.microsoft.com/office/drawing/2017/model3d" xmlns:o="urn:schemas-microsoft-com:office:office" xmlns:oel="http://schemas.microsoft.com/office/2019/extlst" xmlns:r="http://schemas.openxmlformats.org/officeDocument/2006/relationships" xmlns:m="http://schemas.openxmlformats.org/officeDocument/2006/math" xmlns:v="urn:schemas-microsoft-com:vml" xmlns:wp14="http://schemas.microsoft.com/office/word/2010/wordprocessingDrawing" xmlns:wp="http://schemas.openxmlformats.org/drawingml/2006/wordprocessingDrawing" xmlns:w10="urn:schemas-microsoft-com:office:word" xmlns:w="http://schemas.openxmlformats.org/wordprocessingml/2006/main" xmlns:w14="http://schemas.microsoft.com/office/word/2010/wordml" xmlns:w15="http://schemas.microsoft.com/office/word/2012/wordml" xmlns:w16cex="http://schemas.microsoft.com/office/word/2018/wordml/cex" xmlns:w16cid="http://schemas.microsoft.com/office/word/2016/wordml/cid" xmlns:w16="http://schemas.microsoft.com/office/word/2018/wordml" xmlns:w16du="http://schemas.microsoft.com/office/word/2023/wordml/word16du" xmlns:w16sdtdh="http://schemas.microsoft.com/office/word/2020/wordml/sdtdatahash" xmlns:w16sdtfl="http://schemas.microsoft.com/office/word/2024/wordml/sdtformatlock" xmlns:w16se="http://schemas.microsoft.com/office/word/2015/wordml/symex" xmlns:wpg="http://schemas.microsoft.com/office/word/2010/wordprocessingGroup" xmlns:wpi="http://schemas.microsoft.com/office/word/2010/wordprocessingInk" xmlns:wne="http://schemas.microsoft.com/office/word/2006/wordml" xmlns:wps="http://schemas.microsoft.com/office/word/2010/wordprocessingShape" mc:Ignorable="w14 w15 w16se w16cid w16 w16cex w16sdtdh w16sdtfl w16du wp14">
+<w:numbering xmlns:wpc="http://schemas.microsoft.com/office/word/2010/wordprocessingCanvas" xmlns:cx="http://schemas.microsoft.com/office/drawing/2014/chartex" xmlns:cx1="http://schemas.microsoft.com/office/drawing/2015/9/8/chartex" xmlns:cx2="http://schemas.microsoft.com/office/drawing/2015/10/21/chartex" xmlns:cx3="http://schemas.microsoft.com/office/drawing/2016/5/9/chartex" xmlns:cx4="http://schemas.microsoft.com/office/drawing/2016/5/10/chartex" xmlns:cx5="http://schemas.microsoft.com/office/drawing/2016/5/11/chartex" xmlns:cx6="http://schemas.microsoft.com/office/drawing/2016/5/12/chartex" xmlns:cx7="http://schemas.microsoft.com/office/drawing/2016/5/13/chartex" xmlns:cx8="http://schemas.microsoft.com/office/drawing/2016/5/14/chartex" xmlns:mc="http://schemas.openxmlformats.org/markup-compatibility/2006" xmlns:m="http://schemas.openxmlformats.org/officeDocument/2006/math" xmlns:aink="http://schemas.microsoft.com/office/drawing/2016/ink" xmlns:am3d="http://schemas.microsoft.com/office/drawing/2017/model3d" xmlns:oel="http://schemas.microsoft.com/office/2019/extlst" xmlns:r="http://schemas.openxmlformats.org/officeDocument/2006/relationships" xmlns:wp14="http://schemas.microsoft.com/office/word/2010/wordprocessingDrawing" xmlns:wp="http://schemas.openxmlformats.org/drawingml/2006/wordprocessingDrawing" xmlns:wpg="http://schemas.microsoft.com/office/word/2010/wordprocessingGroup" xmlns:wpi="http://schemas.microsoft.com/office/word/2010/wordprocessingInk" xmlns:wps="http://schemas.microsoft.com/office/word/2010/wordprocessingShape" xmlns:o="urn:schemas-microsoft-com:office:office" xmlns:v="urn:schemas-microsoft-com:vml" xmlns:w10="urn:schemas-microsoft-com:office:word" xmlns:w="http://schemas.openxmlformats.org/wordprocessingml/2006/main" xmlns:w14="http://schemas.microsoft.com/office/word/2010/wordml" xmlns:w15="http://schemas.microsoft.com/office/word/2012/wordml" xmlns:w16cex="http://schemas.microsoft.com/office/word/2018/wordml/cex" xmlns:w16cid="http://schemas.microsoft.com/office/word/2016/wordml/cid" xmlns:w16="http://schemas.microsoft.com/office/word/2018/wordml" xmlns:w16sdtdh="http://schemas.microsoft.com/office/word/2020/wordml/sdtdatahash" xmlns:w16sdtfl="http://schemas.microsoft.com/office/word/2024/wordml/sdtformatlock" xmlns:w16se="http://schemas.microsoft.com/office/word/2015/wordml/symex" xmlns:w16du="http://schemas.microsoft.com/office/word/2023/wordml/word16du" xmlns:wne="http://schemas.microsoft.com/office/word/2006/wordml" mc:Ignorable="w14 w15 w16se w16cid w16 w16cex w16sdtdh w16sdtfl w16du wp14">
   <w:abstractNum w:abstractNumId="0" w15:restartNumberingAfterBreak="0">
     <w:nsid w:val="1A170B67"/>
     <w:multiLevelType w:val="multilevel"/>
@@ -3616,7 +3529,7 @@
 </file>
 
 <file path=word/styles.xml><?xml version="1.0" encoding="utf-8"?>
-<w:styles xmlns:mc="http://schemas.openxmlformats.org/markup-compatibility/2006" xmlns:r="http://schemas.openxmlformats.org/officeDocument/2006/relationships" xmlns:w="http://schemas.openxmlformats.org/wordprocessingml/2006/main" xmlns:w14="http://schemas.microsoft.com/office/word/2010/wordml" xmlns:w15="http://schemas.microsoft.com/office/word/2012/wordml" xmlns:w16cex="http://schemas.microsoft.com/office/word/2018/wordml/cex" xmlns:w16cid="http://schemas.microsoft.com/office/word/2016/wordml/cid" xmlns:w16="http://schemas.microsoft.com/office/word/2018/wordml" xmlns:w16du="http://schemas.microsoft.com/office/word/2023/wordml/word16du" xmlns:w16sdtdh="http://schemas.microsoft.com/office/word/2020/wordml/sdtdatahash" xmlns:w16sdtfl="http://schemas.microsoft.com/office/word/2024/wordml/sdtformatlock" xmlns:w16se="http://schemas.microsoft.com/office/word/2015/wordml/symex" mc:Ignorable="w14 w15 w16se w16cid w16 w16cex w16sdtdh w16sdtfl w16du">
+<w:styles xmlns:mc="http://schemas.openxmlformats.org/markup-compatibility/2006" xmlns:r="http://schemas.openxmlformats.org/officeDocument/2006/relationships" xmlns:w="http://schemas.openxmlformats.org/wordprocessingml/2006/main" xmlns:w14="http://schemas.microsoft.com/office/word/2010/wordml" xmlns:w15="http://schemas.microsoft.com/office/word/2012/wordml" xmlns:w16cex="http://schemas.microsoft.com/office/word/2018/wordml/cex" xmlns:w16cid="http://schemas.microsoft.com/office/word/2016/wordml/cid" xmlns:w16="http://schemas.microsoft.com/office/word/2018/wordml" xmlns:w16sdtdh="http://schemas.microsoft.com/office/word/2020/wordml/sdtdatahash" xmlns:w16sdtfl="http://schemas.microsoft.com/office/word/2024/wordml/sdtformatlock" xmlns:w16se="http://schemas.microsoft.com/office/word/2015/wordml/symex" xmlns:w16du="http://schemas.microsoft.com/office/word/2023/wordml/word16du" mc:Ignorable="w14 w15 w16se w16cid w16 w16cex w16sdtdh w16sdtfl w16du">
   <w:docDefaults>
     <w:rPrDefault>
       <w:rPr>

</xml_diff>